<commit_message>
rush before demo, working on last line preview
</commit_message>
<xml_diff>
--- a/Documentation/Learning Django - official tutorial.docx
+++ b/Documentation/Learning Django - official tutorial.docx
@@ -425,205 +425,9 @@
       <w:pPr>
         <w:pStyle w:val="Heading1"/>
       </w:pPr>
-      <w:r>
-        <w:t>(Change project name)</w:t>
-      </w:r>
-    </w:p>
-    <w:p>
-      <w:pPr>
-        <w:pStyle w:val="ListParagraph"/>
-        <w:numPr>
-          <w:ilvl w:val="0"/>
-          <w:numId w:val="1"/>
-        </w:numPr>
-        <w:rPr>
-          <w:lang w:val="fr-BE"/>
-        </w:rPr>
-      </w:pPr>
-      <w:r>
-        <w:rPr>
-          <w:lang w:val="fr-BE"/>
-        </w:rPr>
-        <w:t>Réponses en lignes indiquent tout ce qu’il faut changer dans les scripts/modules Django</w:t>
-      </w:r>
-    </w:p>
-    <w:p>
-      <w:pPr>
-        <w:pStyle w:val="ListParagraph"/>
-        <w:numPr>
-          <w:ilvl w:val="0"/>
-          <w:numId w:val="1"/>
-        </w:numPr>
-        <w:rPr>
-          <w:lang w:val="fr-BE"/>
-        </w:rPr>
-      </w:pPr>
-      <w:r>
-        <w:rPr>
-          <w:lang w:val="fr-BE"/>
-        </w:rPr>
-        <w:t xml:space="preserve">Pour l’environnement virtuel, il faut le </w:t>
-      </w:r>
-      <w:proofErr w:type="spellStart"/>
-      <w:r>
-        <w:rPr>
-          <w:lang w:val="fr-BE"/>
-        </w:rPr>
-        <w:t>deleter</w:t>
-      </w:r>
-      <w:proofErr w:type="spellEnd"/>
-      <w:r>
-        <w:rPr>
-          <w:lang w:val="fr-BE"/>
-        </w:rPr>
-        <w:t xml:space="preserve"> et le recréer. Pour </w:t>
-      </w:r>
-      <w:proofErr w:type="spellStart"/>
-      <w:r>
-        <w:rPr>
-          <w:lang w:val="fr-BE"/>
-        </w:rPr>
-        <w:t>ca</w:t>
-      </w:r>
-      <w:proofErr w:type="spellEnd"/>
-      <w:r>
-        <w:rPr>
-          <w:lang w:val="fr-BE"/>
-        </w:rPr>
-        <w:t xml:space="preserve"> le plus simple est d’abord de faire un </w:t>
-      </w:r>
-      <w:proofErr w:type="spellStart"/>
-      <w:r>
-        <w:rPr>
-          <w:lang w:val="fr-BE"/>
-        </w:rPr>
-        <w:t>pip</w:t>
-      </w:r>
-      <w:proofErr w:type="spellEnd"/>
-      <w:r>
-        <w:rPr>
-          <w:lang w:val="fr-BE"/>
-        </w:rPr>
-        <w:t xml:space="preserve"> </w:t>
-      </w:r>
-      <w:proofErr w:type="spellStart"/>
-      <w:r>
-        <w:rPr>
-          <w:lang w:val="fr-BE"/>
-        </w:rPr>
-        <w:t>freeze</w:t>
-      </w:r>
-      <w:proofErr w:type="spellEnd"/>
-      <w:r>
-        <w:rPr>
-          <w:lang w:val="fr-BE"/>
-        </w:rPr>
-        <w:t xml:space="preserve"> qui sauve la version de toutes les librairies and </w:t>
-      </w:r>
-      <w:proofErr w:type="spellStart"/>
-      <w:r>
-        <w:rPr>
-          <w:lang w:val="fr-BE"/>
-        </w:rPr>
-        <w:t>co</w:t>
-      </w:r>
-      <w:proofErr w:type="spellEnd"/>
-      <w:r>
-        <w:rPr>
-          <w:lang w:val="fr-BE"/>
-        </w:rPr>
-        <w:t xml:space="preserve"> </w:t>
-      </w:r>
-      <w:hyperlink r:id="rId12" w:history="1">
-        <w:r>
-          <w:rPr>
-            <w:rStyle w:val="Hyperlink"/>
-            <w:lang w:val="fr-BE"/>
-          </w:rPr>
-          <w:t>https://stackoverflow.com/questions/43256369/how-to-rename-a-virtualenv-in-python</w:t>
-        </w:r>
-      </w:hyperlink>
-      <w:r>
-        <w:rPr>
-          <w:lang w:val="fr-BE"/>
-        </w:rPr>
-        <w:t xml:space="preserve"> . Ensuite, il faut linker le python </w:t>
-      </w:r>
-      <w:proofErr w:type="spellStart"/>
-      <w:r>
-        <w:rPr>
-          <w:lang w:val="fr-BE"/>
-        </w:rPr>
-        <w:t>interpreter</w:t>
-      </w:r>
-      <w:proofErr w:type="spellEnd"/>
-      <w:r>
-        <w:rPr>
-          <w:lang w:val="fr-BE"/>
-        </w:rPr>
-        <w:t xml:space="preserve"> de vs code au nouveau </w:t>
-      </w:r>
-      <w:proofErr w:type="spellStart"/>
-      <w:r>
-        <w:rPr>
-          <w:lang w:val="fr-BE"/>
-        </w:rPr>
-        <w:t>virtualenv</w:t>
-      </w:r>
-      <w:proofErr w:type="spellEnd"/>
-      <w:r>
-        <w:rPr>
-          <w:lang w:val="fr-BE"/>
-        </w:rPr>
-        <w:t xml:space="preserve">. Le plus simple serait d’avoir un </w:t>
-      </w:r>
-      <w:proofErr w:type="spellStart"/>
-      <w:r>
-        <w:rPr>
-          <w:lang w:val="fr-BE"/>
-        </w:rPr>
-        <w:t>virtualenv</w:t>
-      </w:r>
-      <w:proofErr w:type="spellEnd"/>
-      <w:r>
-        <w:rPr>
-          <w:lang w:val="fr-BE"/>
-        </w:rPr>
-        <w:t xml:space="preserve"> pour tous les projets</w:t>
-      </w:r>
-      <w:r>
-        <w:rPr>
-          <w:lang w:val="fr-BE"/>
-        </w:rPr>
-        <w:t>/tests</w:t>
-      </w:r>
-      <w:r>
-        <w:rPr>
-          <w:lang w:val="fr-BE"/>
-        </w:rPr>
-        <w:t xml:space="preserve"> liés à </w:t>
-      </w:r>
-      <w:proofErr w:type="spellStart"/>
-      <w:r>
-        <w:rPr>
-          <w:lang w:val="fr-BE"/>
-        </w:rPr>
-        <w:t>Coopia</w:t>
-      </w:r>
-      <w:proofErr w:type="spellEnd"/>
-      <w:r>
-        <w:rPr>
-          <w:lang w:val="fr-BE"/>
-        </w:rPr>
-        <w:t>…</w:t>
-      </w:r>
-    </w:p>
-    <w:p>
-      <w:pPr>
-        <w:pStyle w:val="Heading1"/>
-      </w:pPr>
-      <w:r>
-        <w:lastRenderedPageBreak/>
+      <w:bookmarkStart w:id="0" w:name="_GoBack"/>
+      <w:bookmarkEnd w:id="0"/>
+      <w:r>
         <w:t>Admin</w:t>
       </w:r>
     </w:p>
@@ -651,7 +455,7 @@
                     </pic:cNvPicPr>
                   </pic:nvPicPr>
                   <pic:blipFill>
-                    <a:blip r:embed="rId13">
+                    <a:blip r:embed="rId12">
                       <a:extLst>
                         <a:ext uri="{28A0092B-C50C-407E-A947-70E740481C1C}">
                           <a14:useLocalDpi xmlns:a14="http://schemas.microsoft.com/office/drawing/2010/main" val="0"/>
@@ -690,6 +494,7 @@
           <w:noProof/>
           <w:lang w:eastAsia="en-GB"/>
         </w:rPr>
+        <w:lastRenderedPageBreak/>
         <w:drawing>
           <wp:inline distT="0" distB="0" distL="0" distR="0">
             <wp:extent cx="5753100" cy="1440180"/>
@@ -708,7 +513,7 @@
                     </pic:cNvPicPr>
                   </pic:nvPicPr>
                   <pic:blipFill>
-                    <a:blip r:embed="rId14" cstate="print">
+                    <a:blip r:embed="rId13" cstate="print">
                       <a:extLst>
                         <a:ext uri="{28A0092B-C50C-407E-A947-70E740481C1C}">
                           <a14:useLocalDpi xmlns:a14="http://schemas.microsoft.com/office/drawing/2010/main" val="0"/>
@@ -786,7 +591,7 @@
                     </pic:cNvPicPr>
                   </pic:nvPicPr>
                   <pic:blipFill>
-                    <a:blip r:embed="rId15">
+                    <a:blip r:embed="rId14">
                       <a:extLst>
                         <a:ext uri="{28A0092B-C50C-407E-A947-70E740481C1C}">
                           <a14:useLocalDpi xmlns:a14="http://schemas.microsoft.com/office/drawing/2010/main" val="0"/>
@@ -842,7 +647,7 @@
                     </pic:cNvPicPr>
                   </pic:nvPicPr>
                   <pic:blipFill>
-                    <a:blip r:embed="rId16">
+                    <a:blip r:embed="rId15">
                       <a:extLst>
                         <a:ext uri="{28A0092B-C50C-407E-A947-70E740481C1C}">
                           <a14:useLocalDpi xmlns:a14="http://schemas.microsoft.com/office/drawing/2010/main" val="0"/>
@@ -873,8 +678,6 @@
           </wp:inline>
         </w:drawing>
       </w:r>
-      <w:bookmarkStart w:id="0" w:name="_GoBack"/>
-      <w:bookmarkEnd w:id="0"/>
     </w:p>
     <w:p>
       <w:pPr>
@@ -908,7 +711,7 @@
                     </pic:cNvPicPr>
                   </pic:nvPicPr>
                   <pic:blipFill>
-                    <a:blip r:embed="rId17">
+                    <a:blip r:embed="rId16">
                       <a:extLst>
                         <a:ext uri="{28A0092B-C50C-407E-A947-70E740481C1C}">
                           <a14:useLocalDpi xmlns:a14="http://schemas.microsoft.com/office/drawing/2010/main" val="0"/>
@@ -946,7 +749,6 @@
           <w:noProof/>
           <w:lang w:eastAsia="en-GB"/>
         </w:rPr>
-        <w:lastRenderedPageBreak/>
         <w:drawing>
           <wp:inline distT="0" distB="0" distL="0" distR="0">
             <wp:extent cx="5760720" cy="609600"/>
@@ -965,7 +767,7 @@
                     </pic:cNvPicPr>
                   </pic:nvPicPr>
                   <pic:blipFill>
-                    <a:blip r:embed="rId18">
+                    <a:blip r:embed="rId17">
                       <a:extLst>
                         <a:ext uri="{28A0092B-C50C-407E-A947-70E740481C1C}">
                           <a14:useLocalDpi xmlns:a14="http://schemas.microsoft.com/office/drawing/2010/main" val="0"/>
@@ -998,7 +800,7 @@
       </w:r>
     </w:p>
     <w:p>
-      <w:hyperlink r:id="rId19" w:history="1">
+      <w:hyperlink r:id="rId18" w:history="1">
         <w:r>
           <w:rPr>
             <w:rStyle w:val="Hyperlink"/>

</xml_diff>